<commit_message>
vector embeddingfor words, sentences and documents + cosine similarity + euclidean distance
</commit_message>
<xml_diff>
--- a/plan.docx
+++ b/plan.docx
@@ -13,7 +13,21 @@
         <w:rPr>
           <w:lang w:val="en-US"/>
         </w:rPr>
-        <w:t>1. Roadmap complète — GAN (Generative Adversarial Networks)</w:t>
+        <w:t xml:space="preserve">1. Roadmap </w:t>
+      </w:r>
+      <w:proofErr w:type="spellStart"/>
+      <w:r>
+        <w:rPr>
+          <w:lang w:val="en-US"/>
+        </w:rPr>
+        <w:t>complète</w:t>
+      </w:r>
+      <w:proofErr w:type="spellEnd"/>
+      <w:r>
+        <w:rPr>
+          <w:lang w:val="en-US"/>
+        </w:rPr>
+        <w:t xml:space="preserve"> — GAN (Generative Adversarial Networks)</w:t>
       </w:r>
     </w:p>
     <w:p>
@@ -99,11 +113,19 @@
           <w:highlight w:val="cyan"/>
         </w:rPr>
       </w:pPr>
+      <w:proofErr w:type="gramStart"/>
       <w:r>
         <w:rPr>
           <w:highlight w:val="cyan"/>
         </w:rPr>
-        <w:t xml:space="preserve">Fonction objectif : </w:t>
+        <w:t>Fonction objectif</w:t>
+      </w:r>
+      <w:proofErr w:type="gramEnd"/>
+      <w:r>
+        <w:rPr>
+          <w:highlight w:val="cyan"/>
+        </w:rPr>
+        <w:t xml:space="preserve"> : </w:t>
       </w:r>
     </w:p>
     <w:p>
@@ -116,11 +138,33 @@
           <w:highlight w:val="yellow"/>
         </w:rPr>
       </w:pPr>
-      <w:r>
-        <w:rPr>
-          <w:highlight w:val="yellow"/>
-        </w:rPr>
-        <w:t xml:space="preserve">Binary cross entropy </w:t>
+      <w:proofErr w:type="spellStart"/>
+      <w:r>
+        <w:rPr>
+          <w:highlight w:val="yellow"/>
+        </w:rPr>
+        <w:t>Binary</w:t>
+      </w:r>
+      <w:proofErr w:type="spellEnd"/>
+      <w:r>
+        <w:rPr>
+          <w:highlight w:val="yellow"/>
+        </w:rPr>
+        <w:t xml:space="preserve"> cross </w:t>
+      </w:r>
+      <w:proofErr w:type="spellStart"/>
+      <w:r>
+        <w:rPr>
+          <w:highlight w:val="yellow"/>
+        </w:rPr>
+        <w:t>entropy</w:t>
+      </w:r>
+      <w:proofErr w:type="spellEnd"/>
+      <w:r>
+        <w:rPr>
+          <w:highlight w:val="yellow"/>
+        </w:rPr>
+        <w:t xml:space="preserve"> </w:t>
       </w:r>
     </w:p>
     <w:p>
@@ -165,7 +209,21 @@
         <w:rPr>
           <w:highlight w:val="yellow"/>
         </w:rPr>
-        <w:t xml:space="preserve">Nash equilibrium </w:t>
+        <w:t xml:space="preserve">Nash </w:t>
+      </w:r>
+      <w:proofErr w:type="spellStart"/>
+      <w:r>
+        <w:rPr>
+          <w:highlight w:val="yellow"/>
+        </w:rPr>
+        <w:t>equilibrium</w:t>
+      </w:r>
+      <w:proofErr w:type="spellEnd"/>
+      <w:r>
+        <w:rPr>
+          <w:highlight w:val="yellow"/>
+        </w:rPr>
+        <w:t xml:space="preserve"> </w:t>
       </w:r>
     </w:p>
     <w:p>
@@ -236,13 +294,21 @@
           <w:highlight w:val="yellow"/>
           <w:lang w:val="en-US"/>
         </w:rPr>
-        <w:t>-DC</w:t>
-      </w:r>
+        <w:t>-</w:t>
+      </w:r>
+      <w:proofErr w:type="gramStart"/>
       <w:r>
         <w:rPr>
           <w:highlight w:val="yellow"/>
           <w:lang w:val="en-US"/>
         </w:rPr>
+        <w:t>DC</w:t>
+      </w:r>
+      <w:r>
+        <w:rPr>
+          <w:highlight w:val="yellow"/>
+          <w:lang w:val="en-US"/>
+        </w:rPr>
         <w:t>GAN</w:t>
       </w:r>
       <w:r>
@@ -250,7 +316,15 @@
           <w:highlight w:val="yellow"/>
           <w:lang w:val="en-US"/>
         </w:rPr>
-        <w:t xml:space="preserve"> : spectrally normalized </w:t>
+        <w:t> :</w:t>
+      </w:r>
+      <w:proofErr w:type="gramEnd"/>
+      <w:r>
+        <w:rPr>
+          <w:highlight w:val="yellow"/>
+          <w:lang w:val="en-US"/>
+        </w:rPr>
+        <w:t xml:space="preserve"> spectrally normalized </w:t>
       </w:r>
       <w:r>
         <w:rPr>
@@ -280,7 +354,21 @@
         <w:rPr>
           <w:highlight w:val="yellow"/>
         </w:rPr>
-        <w:t> : wasserstein GAN</w:t>
+        <w:t xml:space="preserve"> : </w:t>
+      </w:r>
+      <w:proofErr w:type="spellStart"/>
+      <w:r>
+        <w:rPr>
+          <w:highlight w:val="yellow"/>
+        </w:rPr>
+        <w:t>wasserstein</w:t>
+      </w:r>
+      <w:proofErr w:type="spellEnd"/>
+      <w:r>
+        <w:rPr>
+          <w:highlight w:val="yellow"/>
+        </w:rPr>
+        <w:t xml:space="preserve"> GAN</w:t>
       </w:r>
     </w:p>
     <w:p>
@@ -306,9 +394,37 @@
           <w:ilvl w:val="0"/>
           <w:numId w:val="3"/>
         </w:numPr>
-      </w:pPr>
-      <w:r>
-        <w:t xml:space="preserve">Conditional GAN (cGAN) </w:t>
+        <w:rPr>
+          <w:highlight w:val="yellow"/>
+        </w:rPr>
+      </w:pPr>
+      <w:proofErr w:type="spellStart"/>
+      <w:r>
+        <w:rPr>
+          <w:highlight w:val="yellow"/>
+        </w:rPr>
+        <w:t>Conditional</w:t>
+      </w:r>
+      <w:proofErr w:type="spellEnd"/>
+      <w:r>
+        <w:rPr>
+          <w:highlight w:val="yellow"/>
+        </w:rPr>
+        <w:t xml:space="preserve"> GAN (</w:t>
+      </w:r>
+      <w:proofErr w:type="spellStart"/>
+      <w:r>
+        <w:rPr>
+          <w:highlight w:val="yellow"/>
+        </w:rPr>
+        <w:t>cGAN</w:t>
+      </w:r>
+      <w:proofErr w:type="spellEnd"/>
+      <w:r>
+        <w:rPr>
+          <w:highlight w:val="yellow"/>
+        </w:rPr>
+        <w:t xml:space="preserve">) </w:t>
       </w:r>
     </w:p>
     <w:p>
@@ -490,12 +606,14 @@
         <w:rPr>
           <w:b/>
           <w:bCs/>
-        </w:rPr>
-      </w:pPr>
-      <w:r>
-        <w:rPr>
-          <w:b/>
-          <w:bCs/>
+          <w:highlight w:val="yellow"/>
+        </w:rPr>
+      </w:pPr>
+      <w:r>
+        <w:rPr>
+          <w:b/>
+          <w:bCs/>
+          <w:highlight w:val="yellow"/>
         </w:rPr>
         <w:t>Étape 4 — GAN conditionnel</w:t>
       </w:r>
@@ -506,266 +624,229 @@
           <w:ilvl w:val="0"/>
           <w:numId w:val="7"/>
         </w:numPr>
-      </w:pPr>
-      <w:r>
-        <w:lastRenderedPageBreak/>
+        <w:rPr>
+          <w:highlight w:val="yellow"/>
+        </w:rPr>
+      </w:pPr>
+      <w:r>
+        <w:rPr>
+          <w:highlight w:val="yellow"/>
+        </w:rPr>
         <w:t xml:space="preserve">Générer des images selon un label </w:t>
       </w:r>
     </w:p>
-    <w:p>
-      <w:r>
-        <w:pict w14:anchorId="03F3974A">
+    <w:p/>
+    <w:p>
+      <w:pPr>
+        <w:pStyle w:val="Titre1"/>
+        <w:rPr>
+          <w:b w:val="0"/>
+          <w:bCs/>
+        </w:rPr>
+      </w:pPr>
+      <w:r>
+        <w:rPr>
+          <w:bCs/>
+        </w:rPr>
+        <w:t>Mes notes de cours :</w:t>
+      </w:r>
+    </w:p>
+    <w:p>
+      <w:r>
+        <w:t>Au début, le Générateur ne sait pas s'il doit dessiner un chat, un chiffre 7, un visage ou autre. Il reçoit juste du bruit (des chiffres au hasard). Pour lui, c'est comme si on lui demandait de dessiner les yeux fermés. Et l’envoie au discriminateur.</w:t>
+      </w:r>
+    </w:p>
+    <w:p>
+      <w:r>
+        <w:rPr>
+          <w:b/>
+          <w:bCs/>
+          <w:color w:val="EE0000"/>
+          <w:u w:val="single"/>
+        </w:rPr>
+        <w:t>Le Discriminateur n'aide jamais volontairement le Générateur</w:t>
+      </w:r>
+      <w:r>
+        <w:t>. Il n'est pas un professeur bienveillant qui dit gentiment : "Hé, modifie le pixel (</w:t>
+      </w:r>
+      <w:proofErr w:type="spellStart"/>
+      <w:proofErr w:type="gramStart"/>
+      <w:r>
+        <w:t>x,y</w:t>
+      </w:r>
+      <w:proofErr w:type="spellEnd"/>
+      <w:proofErr w:type="gramEnd"/>
+      <w:r>
+        <w:t>) pour faire une belle boucle de 8 !".</w:t>
+      </w:r>
+    </w:p>
+    <w:p>
+      <w:r>
+        <w:t>Le Discriminateur est un inspecteur froid et méchant. Tout ce qu'il dit, c'est : "Zéro ! C'est complètement faux !".</w:t>
+      </w:r>
+    </w:p>
+    <w:p>
+      <w:pPr>
+        <w:rPr>
+          <w:b/>
+          <w:bCs/>
+          <w:u w:val="single"/>
+        </w:rPr>
+      </w:pPr>
+      <w:r>
+        <w:rPr>
+          <w:b/>
+          <w:bCs/>
+          <w:u w:val="single"/>
+        </w:rPr>
+        <w:t xml:space="preserve">Alors, comment le Générateur </w:t>
+      </w:r>
+      <w:proofErr w:type="spellStart"/>
+      <w:r>
+        <w:rPr>
+          <w:b/>
+          <w:bCs/>
+          <w:u w:val="single"/>
+        </w:rPr>
+        <w:t>sait-il</w:t>
+      </w:r>
+      <w:proofErr w:type="spellEnd"/>
+      <w:r>
+        <w:rPr>
+          <w:b/>
+          <w:bCs/>
+          <w:u w:val="single"/>
+        </w:rPr>
+        <w:t xml:space="preserve"> quels pixels modifier ?</w:t>
+      </w:r>
+    </w:p>
+    <w:p>
+      <w:r>
+        <w:t xml:space="preserve">C'est grâce à la </w:t>
+      </w:r>
+      <w:proofErr w:type="spellStart"/>
+      <w:r>
+        <w:t>Backpropagation</w:t>
+      </w:r>
+      <w:proofErr w:type="spellEnd"/>
+      <w:r>
+        <w:t xml:space="preserve"> (la rétropropagation du gradient).</w:t>
+      </w:r>
+    </w:p>
+    <w:p>
+      <w:r>
+        <w:t>Quand le Discriminateur donne sa mauvaise note, l'ordinateur calcule des dérivées mathématiques. C'est ce calcul qui se transforme en une carte d'erreurs pour le Générateur.</w:t>
+      </w:r>
+    </w:p>
+    <w:p>
+      <w:r>
+        <w:t>C'est un peu comme si l'inspecteur (le Discriminateur) laissait tomber ses notes d'examen par terre en partant. Le Générateur (le Faussaire) ramasse les notes en cachette, regarde les corrections mathématiques, et se dit : "Ah ! Il a grillé mon faux billet parce que l'encre en haut à gauche était trop claire. Je vais corriger ça".</w:t>
+      </w:r>
+    </w:p>
+    <w:p>
+      <w:r>
+        <w:t>Donc, le Discriminateur "aide" le Générateur malgré lui, par le simple fait de donner une note et de laisser les traces mathématiques de ses critères de notation.</w:t>
+      </w:r>
+    </w:p>
+    <w:p>
+      <w:pPr>
+        <w:rPr>
+          <w:b/>
+          <w:bCs/>
+        </w:rPr>
+      </w:pPr>
+      <w:proofErr w:type="gramStart"/>
+      <w:r>
+        <w:rPr>
+          <w:b/>
+          <w:bCs/>
+          <w:highlight w:val="yellow"/>
+        </w:rPr>
+        <w:t>duel</w:t>
+      </w:r>
+      <w:proofErr w:type="gramEnd"/>
+      <w:r>
+        <w:rPr>
+          <w:b/>
+          <w:bCs/>
+          <w:highlight w:val="yellow"/>
+        </w:rPr>
+        <w:t xml:space="preserve"> Min-Max (100% Vrai)</w:t>
+      </w:r>
+    </w:p>
+    <w:p>
+      <w:r>
+        <w:t>Une fois que le Générateur a compris (grâce aux notes ramassées) à quoi doit ressembler un chiffre MNIST, il ne cherche plus à "apprendre", il cherche à gagner.</w:t>
+      </w:r>
+    </w:p>
+    <w:p>
+      <w:r>
+        <w:t>C'est là que le conflit éclate :</w:t>
+      </w:r>
+    </w:p>
+    <w:p/>
+    <w:p>
+      <w:r>
+        <w:t>Le Générateur devient un faussaire d'élite. Il commence à glisser des faux billets hyper réalistes dans le lot.</w:t>
+      </w:r>
+    </w:p>
+    <w:p>
+      <w:r>
+        <w:t>Le Discriminateur se fait piéger. Sa Loss augmente. Il s'énerve et se dit : "Attends un peu, on essaie de me rouler. Je vais analyser les images de beaucoup plus près". Il devient alors plus pointilleux (il apprend à repérer des micro-défauts que le Générateur a laissés).</w:t>
+      </w:r>
+    </w:p>
+    <w:p>
+      <w:r>
+        <w:t>Le Générateur doit à son tour trouver une nouvelle ruse.</w:t>
+      </w:r>
+    </w:p>
+    <w:p>
+      <w:r>
+        <w:t xml:space="preserve">C'est l'essence même du mot </w:t>
+      </w:r>
+      <w:proofErr w:type="spellStart"/>
+      <w:r>
+        <w:t>Adversarial</w:t>
+      </w:r>
+      <w:proofErr w:type="spellEnd"/>
+      <w:r>
+        <w:t xml:space="preserve"> (Adversaire).</w:t>
+      </w:r>
+    </w:p>
+    <w:p>
+      <w:pPr>
+        <w:rPr>
+          <w:b/>
+          <w:bCs/>
+        </w:rPr>
+      </w:pPr>
+      <w:r>
+        <w:rPr>
+          <w:b/>
+          <w:bCs/>
+        </w:rPr>
+        <w:t>« Explication de Gemini »</w:t>
+      </w:r>
+    </w:p>
+    <w:p>
+      <w:r>
+        <w:pict w14:anchorId="32FF9FAA">
           <v:rect id="_x0000_i1027" style="width:0;height:1.5pt" o:hralign="center" o:hrstd="t" o:hr="t" fillcolor="#a0a0a0" stroked="f"/>
         </w:pict>
       </w:r>
     </w:p>
     <w:p>
       <w:pPr>
-        <w:rPr>
-          <w:b/>
-          <w:bCs/>
-        </w:rPr>
-      </w:pPr>
-      <w:r>
-        <w:rPr>
-          <w:b/>
-          <w:bCs/>
-        </w:rPr>
-        <w:t>Mini-projet GAN</w:t>
-      </w:r>
-    </w:p>
-    <w:p>
-      <w:r>
-        <w:rPr>
-          <w:b/>
-          <w:bCs/>
-        </w:rPr>
-        <w:t>Projet : Générateur d’images stylisées</w:t>
-      </w:r>
-    </w:p>
-    <w:p>
-      <w:pPr>
-        <w:numPr>
-          <w:ilvl w:val="0"/>
-          <w:numId w:val="8"/>
-        </w:numPr>
-      </w:pPr>
-      <w:r>
-        <w:t xml:space="preserve">Input : bruit + classe (ex : "chat", "chien") </w:t>
-      </w:r>
-    </w:p>
-    <w:p>
-      <w:pPr>
-        <w:numPr>
-          <w:ilvl w:val="0"/>
-          <w:numId w:val="8"/>
-        </w:numPr>
-      </w:pPr>
-      <w:r>
-        <w:t xml:space="preserve">Output : image réaliste </w:t>
-      </w:r>
-    </w:p>
-    <w:p>
-      <w:pPr>
-        <w:numPr>
-          <w:ilvl w:val="0"/>
-          <w:numId w:val="8"/>
-        </w:numPr>
-      </w:pPr>
-      <w:r>
-        <w:t xml:space="preserve">Bonus : </w:t>
-      </w:r>
-    </w:p>
-    <w:p>
-      <w:pPr>
-        <w:numPr>
-          <w:ilvl w:val="1"/>
-          <w:numId w:val="8"/>
-        </w:numPr>
-      </w:pPr>
-      <w:r>
-        <w:t xml:space="preserve">Interface simple (Streamlit) </w:t>
-      </w:r>
-    </w:p>
-    <w:p>
-      <w:pPr>
-        <w:numPr>
-          <w:ilvl w:val="1"/>
-          <w:numId w:val="8"/>
-        </w:numPr>
-      </w:pPr>
-      <w:r>
-        <w:t xml:space="preserve">Comparer GAN vs Diffusion </w:t>
-      </w:r>
-    </w:p>
-    <w:p/>
-    <w:p>
-      <w:pPr>
         <w:pStyle w:val="Titre1"/>
-        <w:rPr>
-          <w:b w:val="0"/>
-          <w:bCs/>
-        </w:rPr>
-      </w:pPr>
-      <w:r>
-        <w:rPr>
-          <w:bCs/>
-        </w:rPr>
-        <w:t>Mes notes de cours :</w:t>
-      </w:r>
-    </w:p>
-    <w:p>
-      <w:r>
-        <w:t>Au début, le Générateur ne sait pas s'il doit dessiner un chat, un chiffre 7, un visage ou autre. Il reçoit juste du bruit (des chiffres au hasard). Pour lui, c'est comme si on lui demandait de dessiner les yeux fermés. Et l’envoie au discriminateur.</w:t>
-      </w:r>
-    </w:p>
-    <w:p>
-      <w:r>
-        <w:rPr>
-          <w:b/>
-          <w:bCs/>
-          <w:color w:val="EE0000"/>
-          <w:u w:val="single"/>
-        </w:rPr>
-        <w:t>Le Discriminateur n'aide jamais volontairement le Générateur</w:t>
-      </w:r>
-      <w:r>
-        <w:t>. Il n'est pas un professeur bienveillant qui dit gentiment : "Hé, modifie le pixel (x,y) pour faire une belle boucle de 8 !".</w:t>
-      </w:r>
-    </w:p>
-    <w:p>
-      <w:r>
-        <w:t>Le Discriminateur est un inspecteur froid et méchant. Tout ce qu'il dit, c'est : "Zéro ! C'est complètement faux !".</w:t>
-      </w:r>
-    </w:p>
-    <w:p>
-      <w:pPr>
-        <w:rPr>
-          <w:b/>
-          <w:bCs/>
-          <w:u w:val="single"/>
-        </w:rPr>
-      </w:pPr>
-      <w:r>
-        <w:rPr>
-          <w:b/>
-          <w:bCs/>
-          <w:u w:val="single"/>
-        </w:rPr>
-        <w:t>Alors, comment le Générateur sait-il quels pixels modifier ?</w:t>
-      </w:r>
-    </w:p>
-    <w:p>
-      <w:r>
-        <w:t>C'est grâce à la Backpropagation (la rétropropagation du gradient).</w:t>
-      </w:r>
-    </w:p>
-    <w:p>
-      <w:r>
-        <w:t>Quand le Discriminateur donne sa mauvaise note, l'ordinateur calcule des dérivées mathématiques. C'est ce calcul qui se transforme en une carte d'erreurs pour le Générateur.</w:t>
-      </w:r>
-    </w:p>
-    <w:p>
-      <w:r>
-        <w:t>C'est un peu comme si l'inspecteur (le Discriminateur) laissait tomber ses notes d'examen par terre en partant. Le Générateur (le Faussaire) ramasse les notes en cachette, regarde les corrections mathématiques, et se dit : "Ah ! Il a grillé mon faux billet parce que l'encre en haut à gauche était trop claire. Je vais corriger ça".</w:t>
-      </w:r>
-    </w:p>
-    <w:p>
-      <w:r>
-        <w:t>Donc, le Discriminateur "aide" le Générateur malgré lui, par le simple fait de donner une note et de laisser les traces mathématiques de ses critères de notation.</w:t>
-      </w:r>
-    </w:p>
-    <w:p>
-      <w:pPr>
-        <w:rPr>
-          <w:b/>
-          <w:bCs/>
-        </w:rPr>
-      </w:pPr>
-      <w:r>
-        <w:rPr>
-          <w:b/>
-          <w:bCs/>
-          <w:highlight w:val="yellow"/>
-        </w:rPr>
-        <w:t>duel Min-Max (100% Vrai)</w:t>
-      </w:r>
-    </w:p>
-    <w:p>
-      <w:r>
-        <w:t>Une fois que le Générateur a compris (grâce aux notes ramassées) à quoi doit ressembler un chiffre MNIST, il ne cherche plus à "apprendre", il cherche à gagner.</w:t>
-      </w:r>
-    </w:p>
-    <w:p>
-      <w:r>
-        <w:t>C'est là que le conflit éclate :</w:t>
-      </w:r>
-    </w:p>
-    <w:p/>
-    <w:p>
-      <w:r>
-        <w:t>Le Générateur devient un faussaire d'élite. Il commence à glisser des faux billets hyper réalistes dans le lot.</w:t>
-      </w:r>
-    </w:p>
-    <w:p>
-      <w:r>
-        <w:t>Le Discriminateur se fait piéger. Sa Loss augmente. Il s'énerve et se dit : "Attends un peu, on essaie de me rouler. Je vais analyser les images de beaucoup plus près". Il devient alors plus pointilleux (il apprend à repérer des micro-défauts que le Générateur a laissés).</w:t>
-      </w:r>
-    </w:p>
-    <w:p>
-      <w:r>
-        <w:t>Le Générateur doit à son tour trouver une nouvelle ruse.</w:t>
-      </w:r>
-    </w:p>
-    <w:p>
-      <w:r>
-        <w:t>C'est l'essence même du mot Adversarial (Adversaire).</w:t>
-      </w:r>
-    </w:p>
-    <w:p>
-      <w:pPr>
-        <w:rPr>
-          <w:b/>
-          <w:bCs/>
-        </w:rPr>
-      </w:pPr>
-      <w:r>
-        <w:rPr>
-          <w:b/>
-          <w:bCs/>
-        </w:rPr>
-        <w:t>« Explication de Gemini »</w:t>
-      </w:r>
-    </w:p>
-    <w:p>
-      <w:r>
-        <w:pict w14:anchorId="32FF9FAA">
-          <v:rect id="_x0000_i1028" style="width:0;height:1.5pt" o:hralign="center" o:hrstd="t" o:hr="t" fillcolor="#a0a0a0" stroked="f"/>
-        </w:pict>
-      </w:r>
-    </w:p>
-    <w:p>
-      <w:pPr>
-        <w:rPr>
-          <w:b/>
-          <w:bCs/>
-        </w:rPr>
-      </w:pPr>
-      <w:r>
-        <w:rPr>
-          <w:rFonts w:ascii="Segoe UI Emoji" w:hAnsi="Segoe UI Emoji" w:cs="Segoe UI Emoji"/>
-          <w:b/>
-          <w:bCs/>
-        </w:rPr>
-        <w:t>🔁</w:t>
-      </w:r>
-      <w:r>
-        <w:rPr>
-          <w:b/>
-          <w:bCs/>
-        </w:rPr>
-        <w:t xml:space="preserve"> 2. Roadmap complète — Auto-Encoders</w:t>
-      </w:r>
+      </w:pPr>
+      <w:r>
+        <w:t xml:space="preserve"> 2. Roadmap complète — Auto-</w:t>
+      </w:r>
+      <w:proofErr w:type="spellStart"/>
+      <w:r>
+        <w:t>Encoders</w:t>
+      </w:r>
+      <w:proofErr w:type="spellEnd"/>
     </w:p>
     <w:p>
       <w:pPr>
@@ -837,7 +918,7 @@
     <w:p>
       <w:r>
         <w:pict w14:anchorId="139D15ED">
-          <v:rect id="_x0000_i1029" style="width:0;height:1.5pt" o:hralign="center" o:hrstd="t" o:hr="t" fillcolor="#a0a0a0" stroked="f"/>
+          <v:rect id="_x0000_i1028" style="width:0;height:1.5pt" o:hralign="center" o:hrstd="t" o:hr="t" fillcolor="#a0a0a0" stroked="f"/>
         </w:pict>
       </w:r>
     </w:p>
@@ -861,8 +942,17 @@
           <w:b/>
           <w:bCs/>
         </w:rPr>
-        <w:t xml:space="preserve"> 2. Théorie des Auto-Encoders</w:t>
-      </w:r>
+        <w:t xml:space="preserve"> 2. Théorie des Auto-</w:t>
+      </w:r>
+      <w:proofErr w:type="spellStart"/>
+      <w:r>
+        <w:rPr>
+          <w:b/>
+          <w:bCs/>
+        </w:rPr>
+        <w:t>Encoders</w:t>
+      </w:r>
+      <w:proofErr w:type="spellEnd"/>
     </w:p>
     <w:p>
       <w:pPr>
@@ -898,7 +988,15 @@
         </w:numPr>
       </w:pPr>
       <w:r>
-        <w:t xml:space="preserve">Reconstruction loss </w:t>
+        <w:t xml:space="preserve">Reconstruction </w:t>
+      </w:r>
+      <w:proofErr w:type="spellStart"/>
+      <w:r>
+        <w:t>loss</w:t>
+      </w:r>
+      <w:proofErr w:type="spellEnd"/>
+      <w:r>
+        <w:t xml:space="preserve"> </w:t>
       </w:r>
     </w:p>
     <w:p>
@@ -908,8 +1006,13 @@
           <w:numId w:val="10"/>
         </w:numPr>
       </w:pPr>
-      <w:r>
-        <w:t xml:space="preserve">Bottleneck </w:t>
+      <w:proofErr w:type="spellStart"/>
+      <w:r>
+        <w:t>Bottleneck</w:t>
+      </w:r>
+      <w:proofErr w:type="spellEnd"/>
+      <w:r>
+        <w:t xml:space="preserve"> </w:t>
       </w:r>
     </w:p>
     <w:p>
@@ -935,7 +1038,15 @@
         </w:numPr>
       </w:pPr>
       <w:r>
-        <w:t xml:space="preserve">Vanilla Autoencoder </w:t>
+        <w:t xml:space="preserve">Vanilla </w:t>
+      </w:r>
+      <w:proofErr w:type="spellStart"/>
+      <w:r>
+        <w:t>Autoencoder</w:t>
+      </w:r>
+      <w:proofErr w:type="spellEnd"/>
+      <w:r>
+        <w:t xml:space="preserve"> </w:t>
       </w:r>
     </w:p>
     <w:p>
@@ -945,8 +1056,21 @@
           <w:numId w:val="11"/>
         </w:numPr>
       </w:pPr>
-      <w:r>
-        <w:t xml:space="preserve">Sparse Autoencoder </w:t>
+      <w:proofErr w:type="spellStart"/>
+      <w:r>
+        <w:t>Sparse</w:t>
+      </w:r>
+      <w:proofErr w:type="spellEnd"/>
+      <w:r>
+        <w:t xml:space="preserve"> </w:t>
+      </w:r>
+      <w:proofErr w:type="spellStart"/>
+      <w:r>
+        <w:t>Autoencoder</w:t>
+      </w:r>
+      <w:proofErr w:type="spellEnd"/>
+      <w:r>
+        <w:t xml:space="preserve"> </w:t>
       </w:r>
     </w:p>
     <w:p>
@@ -956,8 +1080,21 @@
           <w:numId w:val="11"/>
         </w:numPr>
       </w:pPr>
-      <w:r>
-        <w:t xml:space="preserve">Denoising Autoencoder </w:t>
+      <w:proofErr w:type="spellStart"/>
+      <w:r>
+        <w:t>Denoising</w:t>
+      </w:r>
+      <w:proofErr w:type="spellEnd"/>
+      <w:r>
+        <w:t xml:space="preserve"> </w:t>
+      </w:r>
+      <w:proofErr w:type="spellStart"/>
+      <w:r>
+        <w:t>Autoencoder</w:t>
+      </w:r>
+      <w:proofErr w:type="spellEnd"/>
+      <w:r>
+        <w:t xml:space="preserve"> </w:t>
       </w:r>
     </w:p>
     <w:p>
@@ -967,8 +1104,21 @@
           <w:numId w:val="11"/>
         </w:numPr>
       </w:pPr>
-      <w:r>
-        <w:t xml:space="preserve">Variational Autoencoder (VAE) </w:t>
+      <w:proofErr w:type="spellStart"/>
+      <w:r>
+        <w:t>Variational</w:t>
+      </w:r>
+      <w:proofErr w:type="spellEnd"/>
+      <w:r>
+        <w:t xml:space="preserve"> </w:t>
+      </w:r>
+      <w:proofErr w:type="spellStart"/>
+      <w:r>
+        <w:t>Autoencoder</w:t>
+      </w:r>
+      <w:proofErr w:type="spellEnd"/>
+      <w:r>
+        <w:t xml:space="preserve"> (VAE) </w:t>
       </w:r>
     </w:p>
     <w:p>
@@ -1000,8 +1150,13 @@
           <w:numId w:val="12"/>
         </w:numPr>
       </w:pPr>
-      <w:r>
-        <w:t xml:space="preserve">Reparameterization trick </w:t>
+      <w:proofErr w:type="spellStart"/>
+      <w:r>
+        <w:t>Reparameterization</w:t>
+      </w:r>
+      <w:proofErr w:type="spellEnd"/>
+      <w:r>
+        <w:t xml:space="preserve"> trick </w:t>
       </w:r>
     </w:p>
     <w:p>
@@ -1018,7 +1173,7 @@
     <w:p>
       <w:r>
         <w:pict w14:anchorId="0C5EDE6C">
-          <v:rect id="_x0000_i1030" style="width:0;height:1.5pt" o:hralign="center" o:hrstd="t" o:hr="t" fillcolor="#a0a0a0" stroked="f"/>
+          <v:rect id="_x0000_i1029" style="width:0;height:1.5pt" o:hralign="center" o:hrstd="t" o:hr="t" fillcolor="#a0a0a0" stroked="f"/>
         </w:pict>
       </w:r>
     </w:p>
@@ -1057,7 +1212,23 @@
           <w:b/>
           <w:bCs/>
         </w:rPr>
-        <w:t>Étape 1 — Autoencoder simple</w:t>
+        <w:t xml:space="preserve">Étape 1 — </w:t>
+      </w:r>
+      <w:proofErr w:type="spellStart"/>
+      <w:r>
+        <w:rPr>
+          <w:b/>
+          <w:bCs/>
+        </w:rPr>
+        <w:t>Autoencoder</w:t>
+      </w:r>
+      <w:proofErr w:type="spellEnd"/>
+      <w:r>
+        <w:rPr>
+          <w:b/>
+          <w:bCs/>
+        </w:rPr>
+        <w:t xml:space="preserve"> simple</w:t>
       </w:r>
     </w:p>
     <w:p>
@@ -1067,8 +1238,13 @@
           <w:numId w:val="13"/>
         </w:numPr>
       </w:pPr>
-      <w:r>
-        <w:t xml:space="preserve">Dataset : MNIST </w:t>
+      <w:proofErr w:type="spellStart"/>
+      <w:r>
+        <w:t>Dataset</w:t>
+      </w:r>
+      <w:proofErr w:type="spellEnd"/>
+      <w:r>
+        <w:t xml:space="preserve"> : MNIST </w:t>
       </w:r>
     </w:p>
     <w:p>
@@ -1079,23 +1255,56 @@
         </w:numPr>
       </w:pPr>
       <w:r>
-        <w:t xml:space="preserve">Encoder + Decoder MLP </w:t>
-      </w:r>
-    </w:p>
-    <w:p>
-      <w:pPr>
-        <w:rPr>
-          <w:b/>
-          <w:bCs/>
-        </w:rPr>
-      </w:pPr>
-      <w:r>
-        <w:rPr>
-          <w:b/>
-          <w:bCs/>
-        </w:rPr>
-        <w:t>Étape 2 — Autoencoder convolutionnel</w:t>
-      </w:r>
+        <w:t xml:space="preserve">Encoder + </w:t>
+      </w:r>
+      <w:proofErr w:type="spellStart"/>
+      <w:r>
+        <w:t>Decoder</w:t>
+      </w:r>
+      <w:proofErr w:type="spellEnd"/>
+      <w:r>
+        <w:t xml:space="preserve"> MLP </w:t>
+      </w:r>
+    </w:p>
+    <w:p>
+      <w:pPr>
+        <w:rPr>
+          <w:b/>
+          <w:bCs/>
+        </w:rPr>
+      </w:pPr>
+      <w:r>
+        <w:rPr>
+          <w:b/>
+          <w:bCs/>
+        </w:rPr>
+        <w:t xml:space="preserve">Étape 2 — </w:t>
+      </w:r>
+      <w:proofErr w:type="spellStart"/>
+      <w:r>
+        <w:rPr>
+          <w:b/>
+          <w:bCs/>
+        </w:rPr>
+        <w:t>Autoencoder</w:t>
+      </w:r>
+      <w:proofErr w:type="spellEnd"/>
+      <w:r>
+        <w:rPr>
+          <w:b/>
+          <w:bCs/>
+        </w:rPr>
+        <w:t xml:space="preserve"> </w:t>
+      </w:r>
+      <w:proofErr w:type="spellStart"/>
+      <w:r>
+        <w:rPr>
+          <w:b/>
+          <w:bCs/>
+        </w:rPr>
+        <w:t>convolutionnel</w:t>
+      </w:r>
+      <w:proofErr w:type="spellEnd"/>
     </w:p>
     <w:p>
       <w:pPr>
@@ -1120,8 +1329,17 @@
           <w:b/>
           <w:bCs/>
         </w:rPr>
-        <w:t>Étape 3 — Denoising</w:t>
-      </w:r>
+        <w:t xml:space="preserve">Étape 3 — </w:t>
+      </w:r>
+      <w:proofErr w:type="spellStart"/>
+      <w:r>
+        <w:rPr>
+          <w:b/>
+          <w:bCs/>
+        </w:rPr>
+        <w:t>Denoising</w:t>
+      </w:r>
+      <w:proofErr w:type="spellEnd"/>
     </w:p>
     <w:p>
       <w:pPr>
@@ -1185,7 +1403,7 @@
     <w:p>
       <w:r>
         <w:pict w14:anchorId="2E8786FD">
-          <v:rect id="_x0000_i1031" style="width:0;height:1.5pt" o:hralign="center" o:hrstd="t" o:hr="t" fillcolor="#a0a0a0" stroked="f"/>
+          <v:rect id="_x0000_i1030" style="width:0;height:1.5pt" o:hralign="center" o:hrstd="t" o:hr="t" fillcolor="#a0a0a0" stroked="f"/>
         </w:pict>
       </w:r>
     </w:p>
@@ -1209,8 +1427,17 @@
           <w:b/>
           <w:bCs/>
         </w:rPr>
-        <w:t xml:space="preserve"> Mini-projet Autoencoder</w:t>
-      </w:r>
+        <w:t xml:space="preserve"> Mini-projet </w:t>
+      </w:r>
+      <w:proofErr w:type="spellStart"/>
+      <w:r>
+        <w:rPr>
+          <w:b/>
+          <w:bCs/>
+        </w:rPr>
+        <w:t>Autoencoder</w:t>
+      </w:r>
+      <w:proofErr w:type="spellEnd"/>
     </w:p>
     <w:p>
       <w:r>
@@ -1239,8 +1466,13 @@
           <w:numId w:val="17"/>
         </w:numPr>
       </w:pPr>
-      <w:r>
-        <w:t xml:space="preserve">Decoder → reconstruire </w:t>
+      <w:proofErr w:type="spellStart"/>
+      <w:r>
+        <w:t>Decoder</w:t>
+      </w:r>
+      <w:proofErr w:type="spellEnd"/>
+      <w:r>
+        <w:t xml:space="preserve"> → reconstruire </w:t>
       </w:r>
     </w:p>
     <w:p>
@@ -1261,8 +1493,13 @@
           <w:numId w:val="17"/>
         </w:numPr>
       </w:pPr>
-      <w:r>
-        <w:t xml:space="preserve">qualité vs taille </w:t>
+      <w:proofErr w:type="gramStart"/>
+      <w:r>
+        <w:t>qualité</w:t>
+      </w:r>
+      <w:proofErr w:type="gramEnd"/>
+      <w:r>
+        <w:t xml:space="preserve"> vs taille </w:t>
       </w:r>
     </w:p>
     <w:p>
@@ -1301,172 +1538,47 @@
     <w:p>
       <w:r>
         <w:pict w14:anchorId="205262C4">
-          <v:rect id="_x0000_i1032" style="width:0;height:1.5pt" o:hralign="center" o:hrstd="t" o:hr="t" fillcolor="#a0a0a0" stroked="f"/>
+          <v:rect id="_x0000_i1031" style="width:0;height:1.5pt" o:hralign="center" o:hrstd="t" o:hr="t" fillcolor="#a0a0a0" stroked="f"/>
         </w:pict>
       </w:r>
     </w:p>
     <w:p>
       <w:pPr>
-        <w:rPr>
-          <w:b/>
-          <w:bCs/>
-        </w:rPr>
-      </w:pPr>
-      <w:r>
-        <w:rPr>
-          <w:rFonts w:ascii="Segoe UI Emoji" w:hAnsi="Segoe UI Emoji" w:cs="Segoe UI Emoji"/>
-          <w:b/>
-          <w:bCs/>
-        </w:rPr>
-        <w:t>🔎</w:t>
-      </w:r>
-      <w:r>
-        <w:rPr>
-          <w:b/>
-          <w:bCs/>
-        </w:rPr>
-        <w:t xml:space="preserve"> 3. Roadmap complète — RAG (Retrieval-Augmented Generation)</w:t>
-      </w:r>
-    </w:p>
-    <w:p>
-      <w:pPr>
-        <w:rPr>
-          <w:b/>
-          <w:bCs/>
-        </w:rPr>
-      </w:pPr>
-      <w:r>
-        <w:rPr>
-          <w:rFonts w:ascii="Segoe UI Emoji" w:hAnsi="Segoe UI Emoji" w:cs="Segoe UI Emoji"/>
-          <w:b/>
-          <w:bCs/>
-        </w:rPr>
-        <w:t>📘</w:t>
-      </w:r>
-      <w:r>
-        <w:rPr>
-          <w:b/>
-          <w:bCs/>
-        </w:rPr>
-        <w:t xml:space="preserve"> 1. Bases indispensables</w:t>
-      </w:r>
-    </w:p>
-    <w:p>
-      <w:pPr>
-        <w:numPr>
-          <w:ilvl w:val="0"/>
-          <w:numId w:val="18"/>
-        </w:numPr>
-      </w:pPr>
-      <w:r>
-        <w:t xml:space="preserve">NLP : </w:t>
-      </w:r>
-    </w:p>
-    <w:p>
-      <w:pPr>
-        <w:numPr>
-          <w:ilvl w:val="1"/>
-          <w:numId w:val="18"/>
-        </w:numPr>
-      </w:pPr>
-      <w:r>
-        <w:t xml:space="preserve">Tokenization </w:t>
-      </w:r>
-    </w:p>
-    <w:p>
-      <w:pPr>
-        <w:numPr>
-          <w:ilvl w:val="1"/>
-          <w:numId w:val="18"/>
-        </w:numPr>
-      </w:pPr>
-      <w:r>
-        <w:t xml:space="preserve">Embeddings </w:t>
-      </w:r>
-    </w:p>
-    <w:p>
-      <w:pPr>
-        <w:numPr>
-          <w:ilvl w:val="0"/>
-          <w:numId w:val="18"/>
-        </w:numPr>
-      </w:pPr>
-      <w:r>
-        <w:t xml:space="preserve">Transformers : </w:t>
-      </w:r>
-    </w:p>
-    <w:p>
-      <w:pPr>
-        <w:numPr>
-          <w:ilvl w:val="1"/>
-          <w:numId w:val="18"/>
-        </w:numPr>
-      </w:pPr>
-      <w:r>
-        <w:t xml:space="preserve">Attention mechanism </w:t>
-      </w:r>
-    </w:p>
-    <w:p>
-      <w:pPr>
-        <w:numPr>
-          <w:ilvl w:val="0"/>
-          <w:numId w:val="18"/>
-        </w:numPr>
-      </w:pPr>
-      <w:r>
-        <w:t xml:space="preserve">LLMs : </w:t>
-      </w:r>
-    </w:p>
-    <w:p>
-      <w:pPr>
-        <w:numPr>
-          <w:ilvl w:val="1"/>
-          <w:numId w:val="18"/>
-        </w:numPr>
-      </w:pPr>
-      <w:r>
-        <w:t xml:space="preserve">GPT, BERT </w:t>
-      </w:r>
-    </w:p>
-    <w:p>
-      <w:pPr>
-        <w:numPr>
-          <w:ilvl w:val="0"/>
-          <w:numId w:val="18"/>
-        </w:numPr>
-      </w:pPr>
-      <w:r>
-        <w:t xml:space="preserve">Bases de données vectorielles </w:t>
-      </w:r>
-    </w:p>
-    <w:p>
-      <w:r>
-        <w:pict w14:anchorId="13A3BE4A">
-          <v:rect id="_x0000_i1033" style="width:0;height:1.5pt" o:hralign="center" o:hrstd="t" o:hr="t" fillcolor="#a0a0a0" stroked="f"/>
-        </w:pict>
-      </w:r>
-    </w:p>
-    <w:p>
-      <w:pPr>
-        <w:rPr>
-          <w:b/>
-          <w:bCs/>
-        </w:rPr>
-      </w:pPr>
-      <w:r>
-        <w:rPr>
-          <w:rFonts w:ascii="Segoe UI Emoji" w:hAnsi="Segoe UI Emoji" w:cs="Segoe UI Emoji"/>
-          <w:b/>
-          <w:bCs/>
-        </w:rPr>
-        <w:t>📘</w:t>
-      </w:r>
-      <w:r>
-        <w:rPr>
-          <w:b/>
-          <w:bCs/>
-        </w:rPr>
-        <w:t xml:space="preserve"> 2. Théorie RAG</w:t>
+        <w:pStyle w:val="Titre1"/>
+      </w:pPr>
+      <w:r>
+        <w:t>3. Roadmap complète — RAG (</w:t>
+      </w:r>
+      <w:proofErr w:type="spellStart"/>
+      <w:r>
+        <w:t>Retrieval-Augmented</w:t>
+      </w:r>
+      <w:proofErr w:type="spellEnd"/>
+      <w:r>
+        <w:t xml:space="preserve"> </w:t>
+      </w:r>
+      <w:proofErr w:type="spellStart"/>
+      <w:r>
+        <w:t>Generation</w:t>
+      </w:r>
+      <w:proofErr w:type="spellEnd"/>
+      <w:r>
+        <w:t>)</w:t>
+      </w:r>
+    </w:p>
+    <w:p>
+      <w:pPr>
+        <w:rPr>
+          <w:b/>
+          <w:bCs/>
+        </w:rPr>
+      </w:pPr>
+      <w:r>
+        <w:rPr>
+          <w:b/>
+          <w:bCs/>
+        </w:rPr>
+        <w:t xml:space="preserve"> Théorie RAG</w:t>
       </w:r>
     </w:p>
     <w:p>
@@ -1490,8 +1602,14 @@
           <w:ilvl w:val="0"/>
           <w:numId w:val="19"/>
         </w:numPr>
-      </w:pPr>
-      <w:r>
+        <w:rPr>
+          <w:highlight w:val="yellow"/>
+        </w:rPr>
+      </w:pPr>
+      <w:r>
+        <w:rPr>
+          <w:highlight w:val="yellow"/>
+        </w:rPr>
         <w:t xml:space="preserve">Retriever (recherche d’information) </w:t>
       </w:r>
     </w:p>
@@ -1502,8 +1620,13 @@
           <w:numId w:val="19"/>
         </w:numPr>
       </w:pPr>
-      <w:r>
-        <w:t xml:space="preserve">Generator (LLM) </w:t>
+      <w:proofErr w:type="spellStart"/>
+      <w:r>
+        <w:t>Generator</w:t>
+      </w:r>
+      <w:proofErr w:type="spellEnd"/>
+      <w:r>
+        <w:t xml:space="preserve"> (LLM) </w:t>
       </w:r>
     </w:p>
     <w:p>
@@ -1527,9 +1650,29 @@
           <w:ilvl w:val="0"/>
           <w:numId w:val="20"/>
         </w:numPr>
-      </w:pPr>
-      <w:r>
-        <w:t xml:space="preserve">Embeddings (OpenAI, Sentence Transformers) </w:t>
+        <w:rPr>
+          <w:highlight w:val="yellow"/>
+        </w:rPr>
+      </w:pPr>
+      <w:r>
+        <w:rPr>
+          <w:highlight w:val="yellow"/>
+        </w:rPr>
+        <w:t>Embeddings (</w:t>
+      </w:r>
+      <w:proofErr w:type="spellStart"/>
+      <w:r>
+        <w:rPr>
+          <w:highlight w:val="yellow"/>
+        </w:rPr>
+        <w:t>OpenAI</w:t>
+      </w:r>
+      <w:proofErr w:type="spellEnd"/>
+      <w:r>
+        <w:rPr>
+          <w:highlight w:val="yellow"/>
+        </w:rPr>
+        <w:t xml:space="preserve">, Sentence Transformers) </w:t>
       </w:r>
     </w:p>
     <w:p>
@@ -1538,9 +1681,43 @@
           <w:ilvl w:val="0"/>
           <w:numId w:val="20"/>
         </w:numPr>
-      </w:pPr>
-      <w:r>
-        <w:t xml:space="preserve">Similarité (cosine similarity) </w:t>
+        <w:rPr>
+          <w:highlight w:val="yellow"/>
+        </w:rPr>
+      </w:pPr>
+      <w:r>
+        <w:rPr>
+          <w:highlight w:val="yellow"/>
+        </w:rPr>
+        <w:t>Similarité (</w:t>
+      </w:r>
+      <w:proofErr w:type="spellStart"/>
+      <w:r>
+        <w:rPr>
+          <w:highlight w:val="yellow"/>
+        </w:rPr>
+        <w:t>cosine</w:t>
+      </w:r>
+      <w:proofErr w:type="spellEnd"/>
+      <w:r>
+        <w:rPr>
+          <w:highlight w:val="yellow"/>
+        </w:rPr>
+        <w:t xml:space="preserve"> </w:t>
+      </w:r>
+      <w:proofErr w:type="spellStart"/>
+      <w:r>
+        <w:rPr>
+          <w:highlight w:val="yellow"/>
+        </w:rPr>
+        <w:t>similarity</w:t>
+      </w:r>
+      <w:proofErr w:type="spellEnd"/>
+      <w:r>
+        <w:rPr>
+          <w:highlight w:val="yellow"/>
+        </w:rPr>
+        <w:t xml:space="preserve">) </w:t>
       </w:r>
     </w:p>
     <w:p>
@@ -1550,8 +1727,13 @@
           <w:numId w:val="20"/>
         </w:numPr>
       </w:pPr>
-      <w:r>
-        <w:t xml:space="preserve">Chunking de documents </w:t>
+      <w:proofErr w:type="spellStart"/>
+      <w:r>
+        <w:t>Chunking</w:t>
+      </w:r>
+      <w:proofErr w:type="spellEnd"/>
+      <w:r>
+        <w:t xml:space="preserve"> de documents </w:t>
       </w:r>
     </w:p>
     <w:p>
@@ -1598,8 +1780,13 @@
           <w:numId w:val="21"/>
         </w:numPr>
       </w:pPr>
-      <w:r>
-        <w:t xml:space="preserve">ChromaDB </w:t>
+      <w:proofErr w:type="spellStart"/>
+      <w:r>
+        <w:t>ChromaDB</w:t>
+      </w:r>
+      <w:proofErr w:type="spellEnd"/>
+      <w:r>
+        <w:t xml:space="preserve"> </w:t>
       </w:r>
     </w:p>
     <w:p>
@@ -1609,8 +1796,13 @@
           <w:numId w:val="21"/>
         </w:numPr>
       </w:pPr>
-      <w:r>
-        <w:t xml:space="preserve">Pinecone </w:t>
+      <w:proofErr w:type="spellStart"/>
+      <w:r>
+        <w:t>Pinecone</w:t>
+      </w:r>
+      <w:proofErr w:type="spellEnd"/>
+      <w:r>
+        <w:t xml:space="preserve"> </w:t>
       </w:r>
     </w:p>
     <w:p>
@@ -1620,14 +1812,27 @@
           <w:numId w:val="21"/>
         </w:numPr>
       </w:pPr>
-      <w:r>
-        <w:t xml:space="preserve">LangChain / LlamaIndex </w:t>
+      <w:proofErr w:type="spellStart"/>
+      <w:r>
+        <w:t>LangChain</w:t>
+      </w:r>
+      <w:proofErr w:type="spellEnd"/>
+      <w:r>
+        <w:t xml:space="preserve"> / </w:t>
+      </w:r>
+      <w:proofErr w:type="spellStart"/>
+      <w:r>
+        <w:t>LlamaIndex</w:t>
+      </w:r>
+      <w:proofErr w:type="spellEnd"/>
+      <w:r>
+        <w:t xml:space="preserve"> </w:t>
       </w:r>
     </w:p>
     <w:p>
       <w:r>
         <w:pict w14:anchorId="0BC7E27F">
-          <v:rect id="_x0000_i1034" style="width:0;height:1.5pt" o:hralign="center" o:hrstd="t" o:hr="t" fillcolor="#a0a0a0" stroked="f"/>
+          <v:rect id="_x0000_i1033" style="width:0;height:1.5pt" o:hralign="center" o:hrstd="t" o:hr="t" fillcolor="#a0a0a0" stroked="f"/>
         </w:pict>
       </w:r>
     </w:p>
@@ -1640,18 +1845,10 @@
       </w:pPr>
       <w:r>
         <w:rPr>
-          <w:rFonts w:ascii="Segoe UI Emoji" w:hAnsi="Segoe UI Emoji" w:cs="Segoe UI Emoji"/>
-          <w:b/>
-          <w:bCs/>
-        </w:rPr>
-        <w:t>🛠️</w:t>
-      </w:r>
-      <w:r>
-        <w:rPr>
-          <w:b/>
-          <w:bCs/>
-        </w:rPr>
-        <w:t xml:space="preserve"> 3. Pratique progressive</w:t>
+          <w:b/>
+          <w:bCs/>
+        </w:rPr>
+        <w:t>Pratique progressive</w:t>
       </w:r>
     </w:p>
     <w:p>
@@ -1675,8 +1872,14 @@
           <w:ilvl w:val="0"/>
           <w:numId w:val="22"/>
         </w:numPr>
-      </w:pPr>
-      <w:r>
+        <w:rPr>
+          <w:highlight w:val="yellow"/>
+        </w:rPr>
+      </w:pPr>
+      <w:r>
+        <w:rPr>
+          <w:highlight w:val="yellow"/>
+        </w:rPr>
         <w:t xml:space="preserve">Convertir texte en vecteurs </w:t>
       </w:r>
     </w:p>
@@ -1686,8 +1889,14 @@
           <w:ilvl w:val="0"/>
           <w:numId w:val="22"/>
         </w:numPr>
-      </w:pPr>
-      <w:r>
+        <w:rPr>
+          <w:highlight w:val="yellow"/>
+        </w:rPr>
+      </w:pPr>
+      <w:r>
+        <w:rPr>
+          <w:highlight w:val="yellow"/>
+        </w:rPr>
         <w:t xml:space="preserve">Mesurer similarité </w:t>
       </w:r>
     </w:p>
@@ -1776,8 +1985,14 @@
           <w:numId w:val="25"/>
         </w:numPr>
       </w:pPr>
-      <w:r>
-        <w:t xml:space="preserve">Chunking intelligent </w:t>
+      <w:proofErr w:type="spellStart"/>
+      <w:r>
+        <w:lastRenderedPageBreak/>
+        <w:t>Chunking</w:t>
+      </w:r>
+      <w:proofErr w:type="spellEnd"/>
+      <w:r>
+        <w:t xml:space="preserve"> intelligent </w:t>
       </w:r>
     </w:p>
     <w:p>
@@ -1788,7 +2003,15 @@
         </w:numPr>
       </w:pPr>
       <w:r>
-        <w:t xml:space="preserve">Re-ranking </w:t>
+        <w:t>Re-</w:t>
+      </w:r>
+      <w:proofErr w:type="spellStart"/>
+      <w:r>
+        <w:t>ranking</w:t>
+      </w:r>
+      <w:proofErr w:type="spellEnd"/>
+      <w:r>
+        <w:t xml:space="preserve"> </w:t>
       </w:r>
     </w:p>
     <w:p>
@@ -1799,13 +2022,29 @@
         </w:numPr>
       </w:pPr>
       <w:r>
-        <w:t xml:space="preserve">Multi-query retrieval </w:t>
+        <w:t>Multi-</w:t>
+      </w:r>
+      <w:proofErr w:type="spellStart"/>
+      <w:r>
+        <w:t>query</w:t>
+      </w:r>
+      <w:proofErr w:type="spellEnd"/>
+      <w:r>
+        <w:t xml:space="preserve"> </w:t>
+      </w:r>
+      <w:proofErr w:type="spellStart"/>
+      <w:r>
+        <w:t>retrieval</w:t>
+      </w:r>
+      <w:proofErr w:type="spellEnd"/>
+      <w:r>
+        <w:t xml:space="preserve"> </w:t>
       </w:r>
     </w:p>
     <w:p>
       <w:r>
         <w:pict w14:anchorId="0E48CBCD">
-          <v:rect id="_x0000_i1035" style="width:0;height:1.5pt" o:hralign="center" o:hrstd="t" o:hr="t" fillcolor="#a0a0a0" stroked="f"/>
+          <v:rect id="_x0000_i1034" style="width:0;height:1.5pt" o:hralign="center" o:hrstd="t" o:hr="t" fillcolor="#a0a0a0" stroked="f"/>
         </w:pict>
       </w:r>
     </w:p>
@@ -1838,7 +2077,23 @@
           <w:b/>
           <w:bCs/>
         </w:rPr>
-        <w:t>Projet : Chatbot intelligent sur documents</w:t>
+        <w:t xml:space="preserve">Projet : </w:t>
+      </w:r>
+      <w:proofErr w:type="spellStart"/>
+      <w:r>
+        <w:rPr>
+          <w:b/>
+          <w:bCs/>
+        </w:rPr>
+        <w:t>Chatbot</w:t>
+      </w:r>
+      <w:proofErr w:type="spellEnd"/>
+      <w:r>
+        <w:rPr>
+          <w:b/>
+          <w:bCs/>
+        </w:rPr>
+        <w:t xml:space="preserve"> intelligent sur documents</w:t>
       </w:r>
     </w:p>
     <w:p>
@@ -1875,8 +2130,13 @@
           <w:numId w:val="27"/>
         </w:numPr>
       </w:pPr>
-      <w:r>
-        <w:t xml:space="preserve">Upload de documents </w:t>
+      <w:proofErr w:type="spellStart"/>
+      <w:r>
+        <w:t>Upload</w:t>
+      </w:r>
+      <w:proofErr w:type="spellEnd"/>
+      <w:r>
+        <w:t xml:space="preserve"> de documents </w:t>
       </w:r>
     </w:p>
     <w:p>

</xml_diff>

<commit_message>
load documents, splitting, embeddings, storing in vector database chromadb using langchain
</commit_message>
<xml_diff>
--- a/plan.docx
+++ b/plan.docx
@@ -13,21 +13,7 @@
         <w:rPr>
           <w:lang w:val="en-US"/>
         </w:rPr>
-        <w:t xml:space="preserve">1. Roadmap </w:t>
-      </w:r>
-      <w:proofErr w:type="spellStart"/>
-      <w:r>
-        <w:rPr>
-          <w:lang w:val="en-US"/>
-        </w:rPr>
-        <w:t>complète</w:t>
-      </w:r>
-      <w:proofErr w:type="spellEnd"/>
-      <w:r>
-        <w:rPr>
-          <w:lang w:val="en-US"/>
-        </w:rPr>
-        <w:t xml:space="preserve"> — GAN (Generative Adversarial Networks)</w:t>
+        <w:t>1. Roadmap complète — GAN (Generative Adversarial Networks)</w:t>
       </w:r>
     </w:p>
     <w:p>
@@ -113,19 +99,11 @@
           <w:highlight w:val="cyan"/>
         </w:rPr>
       </w:pPr>
-      <w:proofErr w:type="gramStart"/>
       <w:r>
         <w:rPr>
           <w:highlight w:val="cyan"/>
         </w:rPr>
-        <w:t>Fonction objectif</w:t>
-      </w:r>
-      <w:proofErr w:type="gramEnd"/>
-      <w:r>
-        <w:rPr>
-          <w:highlight w:val="cyan"/>
-        </w:rPr>
-        <w:t xml:space="preserve"> : </w:t>
+        <w:t xml:space="preserve">Fonction objectif : </w:t>
       </w:r>
     </w:p>
     <w:p>
@@ -138,33 +116,11 @@
           <w:highlight w:val="yellow"/>
         </w:rPr>
       </w:pPr>
-      <w:proofErr w:type="spellStart"/>
-      <w:r>
-        <w:rPr>
-          <w:highlight w:val="yellow"/>
-        </w:rPr>
-        <w:t>Binary</w:t>
-      </w:r>
-      <w:proofErr w:type="spellEnd"/>
-      <w:r>
-        <w:rPr>
-          <w:highlight w:val="yellow"/>
-        </w:rPr>
-        <w:t xml:space="preserve"> cross </w:t>
-      </w:r>
-      <w:proofErr w:type="spellStart"/>
-      <w:r>
-        <w:rPr>
-          <w:highlight w:val="yellow"/>
-        </w:rPr>
-        <w:t>entropy</w:t>
-      </w:r>
-      <w:proofErr w:type="spellEnd"/>
-      <w:r>
-        <w:rPr>
-          <w:highlight w:val="yellow"/>
-        </w:rPr>
-        <w:t xml:space="preserve"> </w:t>
+      <w:r>
+        <w:rPr>
+          <w:highlight w:val="yellow"/>
+        </w:rPr>
+        <w:t xml:space="preserve">Binary cross entropy </w:t>
       </w:r>
     </w:p>
     <w:p>
@@ -209,21 +165,7 @@
         <w:rPr>
           <w:highlight w:val="yellow"/>
         </w:rPr>
-        <w:t xml:space="preserve">Nash </w:t>
-      </w:r>
-      <w:proofErr w:type="spellStart"/>
-      <w:r>
-        <w:rPr>
-          <w:highlight w:val="yellow"/>
-        </w:rPr>
-        <w:t>equilibrium</w:t>
-      </w:r>
-      <w:proofErr w:type="spellEnd"/>
-      <w:r>
-        <w:rPr>
-          <w:highlight w:val="yellow"/>
-        </w:rPr>
-        <w:t xml:space="preserve"> </w:t>
+        <w:t xml:space="preserve">Nash equilibrium </w:t>
       </w:r>
     </w:p>
     <w:p>
@@ -294,37 +236,21 @@
           <w:highlight w:val="yellow"/>
           <w:lang w:val="en-US"/>
         </w:rPr>
-        <w:t>-</w:t>
-      </w:r>
-      <w:proofErr w:type="gramStart"/>
+        <w:t>-DC</w:t>
+      </w:r>
       <w:r>
         <w:rPr>
           <w:highlight w:val="yellow"/>
           <w:lang w:val="en-US"/>
         </w:rPr>
-        <w:t>DC</w:t>
+        <w:t>GAN</w:t>
       </w:r>
       <w:r>
         <w:rPr>
           <w:highlight w:val="yellow"/>
           <w:lang w:val="en-US"/>
         </w:rPr>
-        <w:t>GAN</w:t>
-      </w:r>
-      <w:r>
-        <w:rPr>
-          <w:highlight w:val="yellow"/>
-          <w:lang w:val="en-US"/>
-        </w:rPr>
-        <w:t> :</w:t>
-      </w:r>
-      <w:proofErr w:type="gramEnd"/>
-      <w:r>
-        <w:rPr>
-          <w:highlight w:val="yellow"/>
-          <w:lang w:val="en-US"/>
-        </w:rPr>
-        <w:t xml:space="preserve"> spectrally normalized </w:t>
+        <w:t xml:space="preserve"> : spectrally normalized </w:t>
       </w:r>
       <w:r>
         <w:rPr>
@@ -354,21 +280,7 @@
         <w:rPr>
           <w:highlight w:val="yellow"/>
         </w:rPr>
-        <w:t xml:space="preserve"> : </w:t>
-      </w:r>
-      <w:proofErr w:type="spellStart"/>
-      <w:r>
-        <w:rPr>
-          <w:highlight w:val="yellow"/>
-        </w:rPr>
-        <w:t>wasserstein</w:t>
-      </w:r>
-      <w:proofErr w:type="spellEnd"/>
-      <w:r>
-        <w:rPr>
-          <w:highlight w:val="yellow"/>
-        </w:rPr>
-        <w:t xml:space="preserve"> GAN</w:t>
+        <w:t> : wasserstein GAN</w:t>
       </w:r>
     </w:p>
     <w:p>
@@ -398,33 +310,11 @@
           <w:highlight w:val="yellow"/>
         </w:rPr>
       </w:pPr>
-      <w:proofErr w:type="spellStart"/>
-      <w:r>
-        <w:rPr>
-          <w:highlight w:val="yellow"/>
-        </w:rPr>
-        <w:t>Conditional</w:t>
-      </w:r>
-      <w:proofErr w:type="spellEnd"/>
-      <w:r>
-        <w:rPr>
-          <w:highlight w:val="yellow"/>
-        </w:rPr>
-        <w:t xml:space="preserve"> GAN (</w:t>
-      </w:r>
-      <w:proofErr w:type="spellStart"/>
-      <w:r>
-        <w:rPr>
-          <w:highlight w:val="yellow"/>
-        </w:rPr>
-        <w:t>cGAN</w:t>
-      </w:r>
-      <w:proofErr w:type="spellEnd"/>
-      <w:r>
-        <w:rPr>
-          <w:highlight w:val="yellow"/>
-        </w:rPr>
-        <w:t xml:space="preserve">) </w:t>
+      <w:r>
+        <w:rPr>
+          <w:highlight w:val="yellow"/>
+        </w:rPr>
+        <w:t xml:space="preserve">Conditional GAN (cGAN) </w:t>
       </w:r>
     </w:p>
     <w:p>
@@ -667,17 +557,7 @@
         <w:t>Le Discriminateur n'aide jamais volontairement le Générateur</w:t>
       </w:r>
       <w:r>
-        <w:t>. Il n'est pas un professeur bienveillant qui dit gentiment : "Hé, modifie le pixel (</w:t>
-      </w:r>
-      <w:proofErr w:type="spellStart"/>
-      <w:proofErr w:type="gramStart"/>
-      <w:r>
-        <w:t>x,y</w:t>
-      </w:r>
-      <w:proofErr w:type="spellEnd"/>
-      <w:proofErr w:type="gramEnd"/>
-      <w:r>
-        <w:t>) pour faire une belle boucle de 8 !".</w:t>
+        <w:t>. Il n'est pas un professeur bienveillant qui dit gentiment : "Hé, modifie le pixel (x,y) pour faire une belle boucle de 8 !".</w:t>
       </w:r>
     </w:p>
     <w:p>
@@ -699,79 +579,43 @@
           <w:bCs/>
           <w:u w:val="single"/>
         </w:rPr>
-        <w:t xml:space="preserve">Alors, comment le Générateur </w:t>
-      </w:r>
-      <w:proofErr w:type="spellStart"/>
-      <w:r>
+        <w:t>Alors, comment le Générateur sait-il quels pixels modifier ?</w:t>
+      </w:r>
+    </w:p>
+    <w:p>
+      <w:r>
+        <w:t>C'est grâce à la Backpropagation (la rétropropagation du gradient).</w:t>
+      </w:r>
+    </w:p>
+    <w:p>
+      <w:r>
+        <w:t>Quand le Discriminateur donne sa mauvaise note, l'ordinateur calcule des dérivées mathématiques. C'est ce calcul qui se transforme en une carte d'erreurs pour le Générateur.</w:t>
+      </w:r>
+    </w:p>
+    <w:p>
+      <w:r>
+        <w:t>C'est un peu comme si l'inspecteur (le Discriminateur) laissait tomber ses notes d'examen par terre en partant. Le Générateur (le Faussaire) ramasse les notes en cachette, regarde les corrections mathématiques, et se dit : "Ah ! Il a grillé mon faux billet parce que l'encre en haut à gauche était trop claire. Je vais corriger ça".</w:t>
+      </w:r>
+    </w:p>
+    <w:p>
+      <w:r>
+        <w:t>Donc, le Discriminateur "aide" le Générateur malgré lui, par le simple fait de donner une note et de laisser les traces mathématiques de ses critères de notation.</w:t>
+      </w:r>
+    </w:p>
+    <w:p>
+      <w:pPr>
         <w:rPr>
           <w:b/>
           <w:bCs/>
-          <w:u w:val="single"/>
-        </w:rPr>
-        <w:t>sait-il</w:t>
-      </w:r>
-      <w:proofErr w:type="spellEnd"/>
+        </w:rPr>
+      </w:pPr>
       <w:r>
         <w:rPr>
           <w:b/>
           <w:bCs/>
-          <w:u w:val="single"/>
-        </w:rPr>
-        <w:t xml:space="preserve"> quels pixels modifier ?</w:t>
-      </w:r>
-    </w:p>
-    <w:p>
-      <w:r>
-        <w:t xml:space="preserve">C'est grâce à la </w:t>
-      </w:r>
-      <w:proofErr w:type="spellStart"/>
-      <w:r>
-        <w:t>Backpropagation</w:t>
-      </w:r>
-      <w:proofErr w:type="spellEnd"/>
-      <w:r>
-        <w:t xml:space="preserve"> (la rétropropagation du gradient).</w:t>
-      </w:r>
-    </w:p>
-    <w:p>
-      <w:r>
-        <w:t>Quand le Discriminateur donne sa mauvaise note, l'ordinateur calcule des dérivées mathématiques. C'est ce calcul qui se transforme en une carte d'erreurs pour le Générateur.</w:t>
-      </w:r>
-    </w:p>
-    <w:p>
-      <w:r>
-        <w:t>C'est un peu comme si l'inspecteur (le Discriminateur) laissait tomber ses notes d'examen par terre en partant. Le Générateur (le Faussaire) ramasse les notes en cachette, regarde les corrections mathématiques, et se dit : "Ah ! Il a grillé mon faux billet parce que l'encre en haut à gauche était trop claire. Je vais corriger ça".</w:t>
-      </w:r>
-    </w:p>
-    <w:p>
-      <w:r>
-        <w:t>Donc, le Discriminateur "aide" le Générateur malgré lui, par le simple fait de donner une note et de laisser les traces mathématiques de ses critères de notation.</w:t>
-      </w:r>
-    </w:p>
-    <w:p>
-      <w:pPr>
-        <w:rPr>
-          <w:b/>
-          <w:bCs/>
-        </w:rPr>
-      </w:pPr>
-      <w:proofErr w:type="gramStart"/>
-      <w:r>
-        <w:rPr>
-          <w:b/>
-          <w:bCs/>
-          <w:highlight w:val="yellow"/>
-        </w:rPr>
-        <w:t>duel</w:t>
-      </w:r>
-      <w:proofErr w:type="gramEnd"/>
-      <w:r>
-        <w:rPr>
-          <w:b/>
-          <w:bCs/>
-          <w:highlight w:val="yellow"/>
-        </w:rPr>
-        <w:t xml:space="preserve"> Min-Max (100% Vrai)</w:t>
+          <w:highlight w:val="yellow"/>
+        </w:rPr>
+        <w:t>duel Min-Max (100% Vrai)</w:t>
       </w:r>
     </w:p>
     <w:p>
@@ -802,15 +646,7 @@
     </w:p>
     <w:p>
       <w:r>
-        <w:t xml:space="preserve">C'est l'essence même du mot </w:t>
-      </w:r>
-      <w:proofErr w:type="spellStart"/>
-      <w:r>
-        <w:t>Adversarial</w:t>
-      </w:r>
-      <w:proofErr w:type="spellEnd"/>
-      <w:r>
-        <w:t xml:space="preserve"> (Adversaire).</w:t>
+        <w:t>C'est l'essence même du mot Adversarial (Adversaire).</w:t>
       </w:r>
     </w:p>
     <w:p>
@@ -840,13 +676,8 @@
         <w:pStyle w:val="Titre1"/>
       </w:pPr>
       <w:r>
-        <w:t xml:space="preserve"> 2. Roadmap complète — Auto-</w:t>
-      </w:r>
-      <w:proofErr w:type="spellStart"/>
-      <w:r>
-        <w:t>Encoders</w:t>
-      </w:r>
-      <w:proofErr w:type="spellEnd"/>
+        <w:t xml:space="preserve"> 2. Roadmap complète — Auto-Encoders</w:t>
+      </w:r>
     </w:p>
     <w:p>
       <w:pPr>
@@ -942,17 +773,8 @@
           <w:b/>
           <w:bCs/>
         </w:rPr>
-        <w:t xml:space="preserve"> 2. Théorie des Auto-</w:t>
-      </w:r>
-      <w:proofErr w:type="spellStart"/>
-      <w:r>
-        <w:rPr>
-          <w:b/>
-          <w:bCs/>
-        </w:rPr>
-        <w:t>Encoders</w:t>
-      </w:r>
-      <w:proofErr w:type="spellEnd"/>
+        <w:t xml:space="preserve"> 2. Théorie des Auto-Encoders</w:t>
+      </w:r>
     </w:p>
     <w:p>
       <w:pPr>
@@ -988,15 +810,7 @@
         </w:numPr>
       </w:pPr>
       <w:r>
-        <w:t xml:space="preserve">Reconstruction </w:t>
-      </w:r>
-      <w:proofErr w:type="spellStart"/>
-      <w:r>
-        <w:t>loss</w:t>
-      </w:r>
-      <w:proofErr w:type="spellEnd"/>
-      <w:r>
-        <w:t xml:space="preserve"> </w:t>
+        <w:t xml:space="preserve">Reconstruction loss </w:t>
       </w:r>
     </w:p>
     <w:p>
@@ -1006,13 +820,8 @@
           <w:numId w:val="10"/>
         </w:numPr>
       </w:pPr>
-      <w:proofErr w:type="spellStart"/>
-      <w:r>
-        <w:t>Bottleneck</w:t>
-      </w:r>
-      <w:proofErr w:type="spellEnd"/>
-      <w:r>
-        <w:t xml:space="preserve"> </w:t>
+      <w:r>
+        <w:t xml:space="preserve">Bottleneck </w:t>
       </w:r>
     </w:p>
     <w:p>
@@ -1038,15 +847,7 @@
         </w:numPr>
       </w:pPr>
       <w:r>
-        <w:t xml:space="preserve">Vanilla </w:t>
-      </w:r>
-      <w:proofErr w:type="spellStart"/>
-      <w:r>
-        <w:t>Autoencoder</w:t>
-      </w:r>
-      <w:proofErr w:type="spellEnd"/>
-      <w:r>
-        <w:t xml:space="preserve"> </w:t>
+        <w:t xml:space="preserve">Vanilla Autoencoder </w:t>
       </w:r>
     </w:p>
     <w:p>
@@ -1056,21 +857,8 @@
           <w:numId w:val="11"/>
         </w:numPr>
       </w:pPr>
-      <w:proofErr w:type="spellStart"/>
-      <w:r>
-        <w:t>Sparse</w:t>
-      </w:r>
-      <w:proofErr w:type="spellEnd"/>
-      <w:r>
-        <w:t xml:space="preserve"> </w:t>
-      </w:r>
-      <w:proofErr w:type="spellStart"/>
-      <w:r>
-        <w:t>Autoencoder</w:t>
-      </w:r>
-      <w:proofErr w:type="spellEnd"/>
-      <w:r>
-        <w:t xml:space="preserve"> </w:t>
+      <w:r>
+        <w:t xml:space="preserve">Sparse Autoencoder </w:t>
       </w:r>
     </w:p>
     <w:p>
@@ -1080,21 +868,8 @@
           <w:numId w:val="11"/>
         </w:numPr>
       </w:pPr>
-      <w:proofErr w:type="spellStart"/>
-      <w:r>
-        <w:t>Denoising</w:t>
-      </w:r>
-      <w:proofErr w:type="spellEnd"/>
-      <w:r>
-        <w:t xml:space="preserve"> </w:t>
-      </w:r>
-      <w:proofErr w:type="spellStart"/>
-      <w:r>
-        <w:t>Autoencoder</w:t>
-      </w:r>
-      <w:proofErr w:type="spellEnd"/>
-      <w:r>
-        <w:t xml:space="preserve"> </w:t>
+      <w:r>
+        <w:t xml:space="preserve">Denoising Autoencoder </w:t>
       </w:r>
     </w:p>
     <w:p>
@@ -1104,21 +879,8 @@
           <w:numId w:val="11"/>
         </w:numPr>
       </w:pPr>
-      <w:proofErr w:type="spellStart"/>
-      <w:r>
-        <w:t>Variational</w:t>
-      </w:r>
-      <w:proofErr w:type="spellEnd"/>
-      <w:r>
-        <w:t xml:space="preserve"> </w:t>
-      </w:r>
-      <w:proofErr w:type="spellStart"/>
-      <w:r>
-        <w:t>Autoencoder</w:t>
-      </w:r>
-      <w:proofErr w:type="spellEnd"/>
-      <w:r>
-        <w:t xml:space="preserve"> (VAE) </w:t>
+      <w:r>
+        <w:t xml:space="preserve">Variational Autoencoder (VAE) </w:t>
       </w:r>
     </w:p>
     <w:p>
@@ -1150,13 +912,8 @@
           <w:numId w:val="12"/>
         </w:numPr>
       </w:pPr>
-      <w:proofErr w:type="spellStart"/>
-      <w:r>
-        <w:t>Reparameterization</w:t>
-      </w:r>
-      <w:proofErr w:type="spellEnd"/>
-      <w:r>
-        <w:t xml:space="preserve"> trick </w:t>
+      <w:r>
+        <w:t xml:space="preserve">Reparameterization trick </w:t>
       </w:r>
     </w:p>
     <w:p>
@@ -1212,23 +969,7 @@
           <w:b/>
           <w:bCs/>
         </w:rPr>
-        <w:t xml:space="preserve">Étape 1 — </w:t>
-      </w:r>
-      <w:proofErr w:type="spellStart"/>
-      <w:r>
-        <w:rPr>
-          <w:b/>
-          <w:bCs/>
-        </w:rPr>
-        <w:t>Autoencoder</w:t>
-      </w:r>
-      <w:proofErr w:type="spellEnd"/>
-      <w:r>
-        <w:rPr>
-          <w:b/>
-          <w:bCs/>
-        </w:rPr>
-        <w:t xml:space="preserve"> simple</w:t>
+        <w:t>Étape 1 — Autoencoder simple</w:t>
       </w:r>
     </w:p>
     <w:p>
@@ -1250,15 +991,7 @@
         </w:numPr>
       </w:pPr>
       <w:r>
-        <w:t xml:space="preserve">Encoder + </w:t>
-      </w:r>
-      <w:proofErr w:type="spellStart"/>
-      <w:r>
-        <w:t>Decoder</w:t>
-      </w:r>
-      <w:proofErr w:type="spellEnd"/>
-      <w:r>
-        <w:t xml:space="preserve"> MLP </w:t>
+        <w:t xml:space="preserve">Encoder + Decoder MLP </w:t>
       </w:r>
     </w:p>
     <w:p>
@@ -1273,33 +1006,8 @@
           <w:b/>
           <w:bCs/>
         </w:rPr>
-        <w:t xml:space="preserve">Étape 2 — </w:t>
-      </w:r>
-      <w:proofErr w:type="spellStart"/>
-      <w:r>
-        <w:rPr>
-          <w:b/>
-          <w:bCs/>
-        </w:rPr>
-        <w:t>Autoencoder</w:t>
-      </w:r>
-      <w:proofErr w:type="spellEnd"/>
-      <w:r>
-        <w:rPr>
-          <w:b/>
-          <w:bCs/>
-        </w:rPr>
-        <w:t xml:space="preserve"> </w:t>
-      </w:r>
-      <w:proofErr w:type="spellStart"/>
-      <w:r>
-        <w:rPr>
-          <w:b/>
-          <w:bCs/>
-        </w:rPr>
-        <w:t>convolutionnel</w:t>
-      </w:r>
-      <w:proofErr w:type="spellEnd"/>
+        <w:t>Étape 2 — Autoencoder convolutionnel</w:t>
+      </w:r>
     </w:p>
     <w:p>
       <w:pPr>
@@ -1324,17 +1032,8 @@
           <w:b/>
           <w:bCs/>
         </w:rPr>
-        <w:t xml:space="preserve">Étape 3 — </w:t>
-      </w:r>
-      <w:proofErr w:type="spellStart"/>
-      <w:r>
-        <w:rPr>
-          <w:b/>
-          <w:bCs/>
-        </w:rPr>
-        <w:t>Denoising</w:t>
-      </w:r>
-      <w:proofErr w:type="spellEnd"/>
+        <w:t>Étape 3 — Denoising</w:t>
+      </w:r>
     </w:p>
     <w:p>
       <w:pPr>
@@ -1422,17 +1121,8 @@
           <w:b/>
           <w:bCs/>
         </w:rPr>
-        <w:t xml:space="preserve"> Mini-projet </w:t>
-      </w:r>
-      <w:proofErr w:type="spellStart"/>
-      <w:r>
-        <w:rPr>
-          <w:b/>
-          <w:bCs/>
-        </w:rPr>
-        <w:t>Autoencoder</w:t>
-      </w:r>
-      <w:proofErr w:type="spellEnd"/>
+        <w:t xml:space="preserve"> Mini-projet Autoencoder</w:t>
+      </w:r>
     </w:p>
     <w:p>
       <w:r>
@@ -1461,13 +1151,8 @@
           <w:numId w:val="17"/>
         </w:numPr>
       </w:pPr>
-      <w:proofErr w:type="spellStart"/>
-      <w:r>
-        <w:t>Decoder</w:t>
-      </w:r>
-      <w:proofErr w:type="spellEnd"/>
-      <w:r>
-        <w:t xml:space="preserve"> → reconstruire </w:t>
+      <w:r>
+        <w:t xml:space="preserve">Decoder → reconstruire </w:t>
       </w:r>
     </w:p>
     <w:p>
@@ -1488,13 +1173,8 @@
           <w:numId w:val="17"/>
         </w:numPr>
       </w:pPr>
-      <w:proofErr w:type="gramStart"/>
-      <w:r>
-        <w:t>qualité</w:t>
-      </w:r>
-      <w:proofErr w:type="gramEnd"/>
-      <w:r>
-        <w:t xml:space="preserve"> vs taille </w:t>
+      <w:r>
+        <w:t xml:space="preserve">qualité vs taille </w:t>
       </w:r>
     </w:p>
     <w:p>
@@ -1542,23 +1222,7 @@
         <w:pStyle w:val="Titre1"/>
       </w:pPr>
       <w:r>
-        <w:t>3. Roadmap complète — RAG (</w:t>
-      </w:r>
-      <w:proofErr w:type="spellStart"/>
-      <w:r>
-        <w:t>Retrieval-Augmented</w:t>
-      </w:r>
-      <w:proofErr w:type="spellEnd"/>
-      <w:r>
-        <w:t xml:space="preserve"> </w:t>
-      </w:r>
-      <w:proofErr w:type="spellStart"/>
-      <w:r>
-        <w:t>Generation</w:t>
-      </w:r>
-      <w:proofErr w:type="spellEnd"/>
-      <w:r>
-        <w:t>)</w:t>
+        <w:t>3. Roadmap complète — RAG (Retrieval-Augmented Generation)</w:t>
       </w:r>
     </w:p>
     <w:p>
@@ -1654,21 +1318,7 @@
         <w:rPr>
           <w:highlight w:val="yellow"/>
         </w:rPr>
-        <w:t>Embeddings (</w:t>
-      </w:r>
-      <w:proofErr w:type="spellStart"/>
-      <w:r>
-        <w:rPr>
-          <w:highlight w:val="yellow"/>
-        </w:rPr>
-        <w:t>OpenAI</w:t>
-      </w:r>
-      <w:proofErr w:type="spellEnd"/>
-      <w:r>
-        <w:rPr>
-          <w:highlight w:val="yellow"/>
-        </w:rPr>
-        <w:t xml:space="preserve">, Sentence Transformers) </w:t>
+        <w:t xml:space="preserve">Embeddings (OpenAI, Sentence Transformers) </w:t>
       </w:r>
     </w:p>
     <w:p>
@@ -1685,35 +1335,7 @@
         <w:rPr>
           <w:highlight w:val="yellow"/>
         </w:rPr>
-        <w:t>Similarité (</w:t>
-      </w:r>
-      <w:proofErr w:type="spellStart"/>
-      <w:r>
-        <w:rPr>
-          <w:highlight w:val="yellow"/>
-        </w:rPr>
-        <w:t>cosine</w:t>
-      </w:r>
-      <w:proofErr w:type="spellEnd"/>
-      <w:r>
-        <w:rPr>
-          <w:highlight w:val="yellow"/>
-        </w:rPr>
-        <w:t xml:space="preserve"> </w:t>
-      </w:r>
-      <w:proofErr w:type="spellStart"/>
-      <w:r>
-        <w:rPr>
-          <w:highlight w:val="yellow"/>
-        </w:rPr>
-        <w:t>similarity</w:t>
-      </w:r>
-      <w:proofErr w:type="spellEnd"/>
-      <w:r>
-        <w:rPr>
-          <w:highlight w:val="yellow"/>
-        </w:rPr>
-        <w:t xml:space="preserve">) </w:t>
+        <w:t xml:space="preserve">Similarité (cosine similarity) </w:t>
       </w:r>
     </w:p>
     <w:p>
@@ -1726,19 +1348,11 @@
           <w:highlight w:val="yellow"/>
         </w:rPr>
       </w:pPr>
-      <w:proofErr w:type="spellStart"/>
-      <w:r>
-        <w:rPr>
-          <w:highlight w:val="yellow"/>
-        </w:rPr>
-        <w:t>Chunking</w:t>
-      </w:r>
-      <w:proofErr w:type="spellEnd"/>
-      <w:r>
-        <w:rPr>
-          <w:highlight w:val="yellow"/>
-        </w:rPr>
-        <w:t xml:space="preserve"> de documents </w:t>
+      <w:r>
+        <w:rPr>
+          <w:highlight w:val="yellow"/>
+        </w:rPr>
+        <w:t xml:space="preserve">Chunking de documents </w:t>
       </w:r>
     </w:p>
     <w:p>
@@ -1768,19 +1382,11 @@
           <w:highlight w:val="yellow"/>
         </w:rPr>
       </w:pPr>
-      <w:proofErr w:type="spellStart"/>
-      <w:r>
-        <w:rPr>
-          <w:highlight w:val="yellow"/>
-        </w:rPr>
-        <w:t>Agentic</w:t>
-      </w:r>
-      <w:proofErr w:type="spellEnd"/>
-      <w:r>
-        <w:rPr>
-          <w:highlight w:val="yellow"/>
-        </w:rPr>
-        <w:t xml:space="preserve"> RAG</w:t>
+      <w:r>
+        <w:rPr>
+          <w:highlight w:val="yellow"/>
+        </w:rPr>
+        <w:t>Agentic RAG</w:t>
       </w:r>
     </w:p>
     <w:p>
@@ -1834,8 +1440,6 @@
         </w:rPr>
         <w:t xml:space="preserve">, Pinecone(cloud), </w:t>
       </w:r>
-      <w:proofErr w:type="spellStart"/>
-      <w:proofErr w:type="gramStart"/>
       <w:r>
         <w:rPr>
           <w:b/>
@@ -1844,51 +1448,16 @@
         </w:rPr>
         <w:t>chromadb</w:t>
       </w:r>
-      <w:proofErr w:type="spellEnd"/>
       <w:r>
         <w:rPr>
           <w:lang w:val="en-US"/>
         </w:rPr>
-        <w:t>(</w:t>
-      </w:r>
-      <w:proofErr w:type="gramEnd"/>
-      <w:r>
-        <w:rPr>
-          <w:lang w:val="en-US"/>
-        </w:rPr>
-        <w:t xml:space="preserve">tester </w:t>
-      </w:r>
-      <w:proofErr w:type="spellStart"/>
-      <w:r>
-        <w:rPr>
-          <w:lang w:val="en-US"/>
-        </w:rPr>
-        <w:t>en</w:t>
-      </w:r>
-      <w:proofErr w:type="spellEnd"/>
-      <w:r>
-        <w:rPr>
-          <w:lang w:val="en-US"/>
-        </w:rPr>
-        <w:t xml:space="preserve"> local)</w:t>
-      </w:r>
-    </w:p>
-    <w:p>
-      <w:proofErr w:type="spellStart"/>
-      <w:r>
-        <w:t>Elasticsearch</w:t>
-      </w:r>
-      <w:proofErr w:type="spellEnd"/>
-      <w:r>
-        <w:t xml:space="preserve">/ </w:t>
-      </w:r>
-      <w:proofErr w:type="spellStart"/>
-      <w:r>
-        <w:t>opensearch</w:t>
-      </w:r>
-      <w:proofErr w:type="spellEnd"/>
-      <w:r>
-        <w:t xml:space="preserve"> pour la recherche par</w:t>
+        <w:t>(tester en local)</w:t>
+      </w:r>
+    </w:p>
+    <w:p>
+      <w:r>
+        <w:t>Elasticsearch/ opensearch pour la recherche par</w:t>
       </w:r>
       <w:r>
         <w:t xml:space="preserve"> mots-clés c’est parfait pour la recherche hybride</w:t>
@@ -1912,7 +1481,6 @@
       </w:r>
     </w:p>
     <w:p>
-      <w:proofErr w:type="spellStart"/>
       <w:r>
         <w:rPr>
           <w:b/>
@@ -1920,7 +1488,6 @@
         </w:rPr>
         <w:t>LangChain</w:t>
       </w:r>
-      <w:proofErr w:type="spellEnd"/>
       <w:r>
         <w:rPr>
           <w:b/>
@@ -1939,7 +1506,6 @@
       <w:r>
         <w:t xml:space="preserve"> </w:t>
       </w:r>
-      <w:proofErr w:type="spellStart"/>
       <w:r>
         <w:rPr>
           <w:b/>
@@ -1947,7 +1513,6 @@
         </w:rPr>
         <w:t>LlamaIndex</w:t>
       </w:r>
-      <w:proofErr w:type="spellEnd"/>
       <w:r>
         <w:rPr>
           <w:b/>
@@ -1959,23 +1524,7 @@
         <w:t xml:space="preserve"> le spécialise de la donnée. </w:t>
       </w:r>
       <w:r>
-        <w:t>Il automatise la découpe des textes (</w:t>
-      </w:r>
-      <w:proofErr w:type="spellStart"/>
-      <w:r>
-        <w:t>chunking</w:t>
-      </w:r>
-      <w:proofErr w:type="spellEnd"/>
-      <w:r>
-        <w:t xml:space="preserve">), la gestion des métadonnées, et propose des stratégies de recherche ultra-avancées (comme le Parent-Child retriever ou le Sentence Window </w:t>
-      </w:r>
-      <w:proofErr w:type="spellStart"/>
-      <w:r>
-        <w:t>retrieval</w:t>
-      </w:r>
-      <w:proofErr w:type="spellEnd"/>
-      <w:r>
-        <w:t>).</w:t>
+        <w:t>Il automatise la découpe des textes (chunking), la gestion des métadonnées, et propose des stratégies de recherche ultra-avancées (comme le Parent-Child retriever ou le Sentence Window retrieval).</w:t>
       </w:r>
     </w:p>
     <w:p>
@@ -2156,19 +1705,11 @@
           <w:highlight w:val="yellow"/>
         </w:rPr>
       </w:pPr>
-      <w:proofErr w:type="spellStart"/>
-      <w:r>
-        <w:rPr>
-          <w:highlight w:val="yellow"/>
-        </w:rPr>
-        <w:t>Chunking</w:t>
-      </w:r>
-      <w:proofErr w:type="spellEnd"/>
-      <w:r>
-        <w:rPr>
-          <w:highlight w:val="yellow"/>
-        </w:rPr>
-        <w:t xml:space="preserve"> intelligent </w:t>
+      <w:r>
+        <w:rPr>
+          <w:highlight w:val="yellow"/>
+        </w:rPr>
+        <w:t xml:space="preserve">Chunking intelligent </w:t>
       </w:r>
     </w:p>
     <w:p>
@@ -2185,21 +1726,7 @@
         <w:rPr>
           <w:highlight w:val="yellow"/>
         </w:rPr>
-        <w:t>Re-</w:t>
-      </w:r>
-      <w:proofErr w:type="spellStart"/>
-      <w:r>
-        <w:rPr>
-          <w:highlight w:val="yellow"/>
-        </w:rPr>
-        <w:t>ranking</w:t>
-      </w:r>
-      <w:proofErr w:type="spellEnd"/>
-      <w:r>
-        <w:rPr>
-          <w:highlight w:val="yellow"/>
-        </w:rPr>
-        <w:t xml:space="preserve"> </w:t>
+        <w:t xml:space="preserve">Re-ranking </w:t>
       </w:r>
     </w:p>
     <w:p>
@@ -2216,35 +1743,7 @@
         <w:rPr>
           <w:highlight w:val="yellow"/>
         </w:rPr>
-        <w:t>Multi-</w:t>
-      </w:r>
-      <w:proofErr w:type="spellStart"/>
-      <w:r>
-        <w:rPr>
-          <w:highlight w:val="yellow"/>
-        </w:rPr>
-        <w:t>query</w:t>
-      </w:r>
-      <w:proofErr w:type="spellEnd"/>
-      <w:r>
-        <w:rPr>
-          <w:highlight w:val="yellow"/>
-        </w:rPr>
-        <w:t xml:space="preserve"> </w:t>
-      </w:r>
-      <w:proofErr w:type="spellStart"/>
-      <w:r>
-        <w:rPr>
-          <w:highlight w:val="yellow"/>
-        </w:rPr>
-        <w:t>retrieval</w:t>
-      </w:r>
-      <w:proofErr w:type="spellEnd"/>
-      <w:r>
-        <w:rPr>
-          <w:highlight w:val="yellow"/>
-        </w:rPr>
-        <w:t xml:space="preserve"> </w:t>
+        <w:t xml:space="preserve">Multi-query retrieval </w:t>
       </w:r>
     </w:p>
     <w:p>
@@ -2350,6 +1849,7 @@
       </w:pPr>
       <w:r>
         <w:rPr>
+          <w:noProof/>
           <w:lang w:val="en-US"/>
         </w:rPr>
         <w:drawing>
@@ -2417,6 +1917,7 @@
       </w:pPr>
       <w:r>
         <w:rPr>
+          <w:noProof/>
           <w:lang w:val="en-US"/>
         </w:rPr>
         <w:drawing>
@@ -2524,6 +2025,7 @@
       </w:pPr>
       <w:r>
         <w:rPr>
+          <w:noProof/>
           <w:lang w:val="en-US"/>
         </w:rPr>
         <w:drawing>
@@ -2625,6 +2127,7 @@
       </w:pPr>
       <w:r>
         <w:rPr>
+          <w:noProof/>
           <w:lang w:val="en-US"/>
         </w:rPr>
         <w:drawing>
@@ -2793,6 +2296,13 @@
         </w:rPr>
         <w:t>Mini-projet RAG</w:t>
       </w:r>
+      <w:r>
+        <w:rPr>
+          <w:b/>
+          <w:bCs/>
+        </w:rPr>
+        <w:t xml:space="preserve"> (voir sur github)</w:t>
+      </w:r>
     </w:p>
     <w:p>
       <w:r>
@@ -2844,13 +2354,8 @@
           <w:numId w:val="27"/>
         </w:numPr>
       </w:pPr>
-      <w:proofErr w:type="spellStart"/>
-      <w:r>
-        <w:t>Upload</w:t>
-      </w:r>
-      <w:proofErr w:type="spellEnd"/>
-      <w:r>
-        <w:t xml:space="preserve"> de documents </w:t>
+      <w:r>
+        <w:t xml:space="preserve">Upload de documents </w:t>
       </w:r>
     </w:p>
     <w:p>
@@ -7774,6 +7279,7 @@
   <w:style w:type="character" w:default="1" w:styleId="Policepardfaut">
     <w:name w:val="Default Paragraph Font"/>
     <w:uiPriority w:val="1"/>
+    <w:semiHidden/>
     <w:unhideWhenUsed/>
   </w:style>
   <w:style w:type="table" w:default="1" w:styleId="TableauNormal">

</xml_diff>